<commit_message>
Update NguyenVanNam_CV.docx and NguyenVanNam_CV.pdf, add cv.html
</commit_message>
<xml_diff>
--- a/NguyenVanNam_CV.docx
+++ b/NguyenVanNam_CV.docx
@@ -1,6 +1,6 @@
 
 <file path=word/document.xml><?xml version="1.0" encoding="utf-8"?>
-<w:document xmlns:wpc="http://schemas.microsoft.com/office/word/2010/wordprocessingCanvas" xmlns:cx="http://schemas.microsoft.com/office/drawing/2014/chartex" xmlns:cx1="http://schemas.microsoft.com/office/drawing/2015/9/8/chartex" xmlns:cx2="http://schemas.microsoft.com/office/drawing/2015/10/21/chartex" xmlns:cx3="http://schemas.microsoft.com/office/drawing/2016/5/9/chartex" xmlns:cx4="http://schemas.microsoft.com/office/drawing/2016/5/10/chartex" xmlns:cx5="http://schemas.microsoft.com/office/drawing/2016/5/11/chartex" xmlns:cx6="http://schemas.microsoft.com/office/drawing/2016/5/12/chartex" xmlns:cx7="http://schemas.microsoft.com/office/drawing/2016/5/13/chartex" xmlns:cx8="http://schemas.microsoft.com/office/drawing/2016/5/14/chartex" xmlns:mc="http://schemas.openxmlformats.org/markup-compatibility/2006" xmlns:aink="http://schemas.microsoft.com/office/drawing/2016/ink" xmlns:am3d="http://schemas.microsoft.com/office/drawing/2017/model3d" xmlns:o="urn:schemas-microsoft-com:office:office" xmlns:oel="http://schemas.microsoft.com/office/2019/extlst" xmlns:r="http://schemas.openxmlformats.org/officeDocument/2006/relationships" xmlns:m="http://schemas.openxmlformats.org/officeDocument/2006/math" xmlns:v="urn:schemas-microsoft-com:vml" xmlns:wp14="http://schemas.microsoft.com/office/word/2010/wordprocessingDrawing" xmlns:wp="http://schemas.openxmlformats.org/drawingml/2006/wordprocessingDrawing" xmlns:w10="urn:schemas-microsoft-com:office:word" xmlns:w="http://schemas.openxmlformats.org/wordprocessingml/2006/main" xmlns:w14="http://schemas.microsoft.com/office/word/2010/wordml" xmlns:w15="http://schemas.microsoft.com/office/word/2012/wordml" xmlns:w16cex="http://schemas.microsoft.com/office/word/2018/wordml/cex" xmlns:w16cid="http://schemas.microsoft.com/office/word/2016/wordml/cid" xmlns:w16="http://schemas.microsoft.com/office/word/2018/wordml" xmlns:w16du="http://schemas.microsoft.com/office/word/2023/wordml/word16du" xmlns:w16sdtdh="http://schemas.microsoft.com/office/word/2020/wordml/sdtdatahash" xmlns:w16sdtfl="http://schemas.microsoft.com/office/word/2024/wordml/sdtformatlock" xmlns:w16se="http://schemas.microsoft.com/office/word/2015/wordml/symex" xmlns:wpg="http://schemas.microsoft.com/office/word/2010/wordprocessingGroup" xmlns:wpi="http://schemas.microsoft.com/office/word/2010/wordprocessingInk" xmlns:wne="http://schemas.microsoft.com/office/word/2006/wordml" xmlns:wps="http://schemas.microsoft.com/office/word/2010/wordprocessingShape" mc:Ignorable="w14 w15 w16se w16cid w16 w16cex w16sdtdh w16sdtfl w16du wp14">
+<w:document xmlns:wpc="http://schemas.microsoft.com/office/word/2010/wordprocessingCanvas" xmlns:cx="http://schemas.microsoft.com/office/drawing/2014/chartex" xmlns:cx1="http://schemas.microsoft.com/office/drawing/2015/9/8/chartex" xmlns:cx2="http://schemas.microsoft.com/office/drawing/2015/10/21/chartex" xmlns:cx3="http://schemas.microsoft.com/office/drawing/2016/5/9/chartex" xmlns:cx4="http://schemas.microsoft.com/office/drawing/2016/5/10/chartex" xmlns:cx5="http://schemas.microsoft.com/office/drawing/2016/5/11/chartex" xmlns:cx6="http://schemas.microsoft.com/office/drawing/2016/5/12/chartex" xmlns:cx7="http://schemas.microsoft.com/office/drawing/2016/5/13/chartex" xmlns:cx8="http://schemas.microsoft.com/office/drawing/2016/5/14/chartex" xmlns:mc="http://schemas.openxmlformats.org/markup-compatibility/2006" xmlns:aink="http://schemas.microsoft.com/office/drawing/2016/ink" xmlns:am3d="http://schemas.microsoft.com/office/drawing/2017/model3d" xmlns:o="urn:schemas-microsoft-com:office:office" xmlns:r="http://schemas.openxmlformats.org/officeDocument/2006/relationships" xmlns:m="http://schemas.openxmlformats.org/officeDocument/2006/math" xmlns:v="urn:schemas-microsoft-com:vml" xmlns:wp14="http://schemas.microsoft.com/office/word/2010/wordprocessingDrawing" xmlns:wp="http://schemas.openxmlformats.org/drawingml/2006/wordprocessingDrawing" xmlns:w10="urn:schemas-microsoft-com:office:word" xmlns:w="http://schemas.openxmlformats.org/wordprocessingml/2006/main" xmlns:w14="http://schemas.microsoft.com/office/word/2010/wordml" xmlns:w15="http://schemas.microsoft.com/office/word/2012/wordml" xmlns:w16cex="http://schemas.microsoft.com/office/word/2018/wordml/cex" xmlns:w16cid="http://schemas.microsoft.com/office/word/2016/wordml/cid" xmlns:w16="http://schemas.microsoft.com/office/word/2018/wordml" xmlns:w16sdtdh="http://schemas.microsoft.com/office/word/2020/wordml/sdtdatahash" xmlns:w16se="http://schemas.microsoft.com/office/word/2015/wordml/symex" xmlns:wpg="http://schemas.microsoft.com/office/word/2010/wordprocessingGroup" xmlns:wpi="http://schemas.microsoft.com/office/word/2010/wordprocessingInk" xmlns:wne="http://schemas.microsoft.com/office/word/2006/wordml" xmlns:wps="http://schemas.microsoft.com/office/word/2010/wordprocessingShape" mc:Ignorable="w14 w15 w16se w16cid w16 w16cex w16sdtdh wp14">
   <w:body>
     <w:p>
       <w:pPr>
@@ -147,13 +147,7 @@
               <w:jc w:val="both"/>
             </w:pPr>
             <w:r>
-              <w:t xml:space="preserve">Data Engineer with </w:t>
-            </w:r>
-            <w:r>
-              <w:t xml:space="preserve">strong </w:t>
-            </w:r>
-            <w:r>
-              <w:t>experience building scalable data pipelines, data warehouses, and AI/ML automation systems. Proven track record in enterprise data management, document digitization projects, and cloud deployment. Strong background in software development and project management with expertise in Python, databases, and modern data stack technologies.</w:t>
+              <w:t>Software Engineer with 5+ years of experience designing and building backend systems, internal platforms, and AI-integrated applications. Proven ability to take products from idea to deployment — including document intelligence systems, recommendation engines, and search platforms. Strong foundation in Python, databases, and cloud infrastructure, with hands-on experience applying LLMs and AI agents to real-world business problems.</w:t>
             </w:r>
           </w:p>
         </w:tc>
@@ -347,14 +341,658 @@
     </w:p>
     <w:tbl>
       <w:tblPr>
-        <w:tblW w:w="5042" w:type="pct"/>
-        <w:tblInd w:w="-90" w:type="dxa"/>
+        <w:tblW w:w="5044" w:type="pct"/>
         <w:tblLook w:val="04A0" w:firstRow="1" w:lastRow="0" w:firstColumn="1" w:lastColumn="0" w:noHBand="0" w:noVBand="1"/>
       </w:tblPr>
       <w:tblGrid>
-        <w:gridCol w:w="8101"/>
-        <w:gridCol w:w="2790"/>
+        <w:gridCol w:w="8104"/>
+        <w:gridCol w:w="2791"/>
       </w:tblGrid>
+      <w:tr>
+        <w:trPr>
+          <w:trHeight w:val="189"/>
+        </w:trPr>
+        <w:tc>
+          <w:tcPr>
+            <w:tcW w:w="3717" w:type="pct"/>
+          </w:tcPr>
+          <w:p>
+            <w:pPr>
+              <w:tabs>
+                <w:tab w:val="left" w:pos="9489"/>
+              </w:tabs>
+              <w:spacing w:line="276" w:lineRule="auto"/>
+              <w:ind w:left="75"/>
+              <w:rPr>
+                <w:b/>
+                <w:bCs/>
+              </w:rPr>
+            </w:pPr>
+            <w:r>
+              <w:rPr>
+                <w:b/>
+                <w:bCs/>
+              </w:rPr>
+              <w:t>ECOBA VN JSC</w:t>
+            </w:r>
+          </w:p>
+        </w:tc>
+        <w:tc>
+          <w:tcPr>
+            <w:tcW w:w="1281" w:type="pct"/>
+          </w:tcPr>
+          <w:p>
+            <w:pPr>
+              <w:tabs>
+                <w:tab w:val="left" w:pos="9489"/>
+              </w:tabs>
+              <w:spacing w:line="276" w:lineRule="auto"/>
+              <w:jc w:val="right"/>
+            </w:pPr>
+            <w:r>
+              <w:t>Hanoi, Vietnam</w:t>
+            </w:r>
+          </w:p>
+        </w:tc>
+      </w:tr>
+      <w:tr>
+        <w:trPr>
+          <w:trHeight w:val="268"/>
+        </w:trPr>
+        <w:tc>
+          <w:tcPr>
+            <w:tcW w:w="3717" w:type="pct"/>
+          </w:tcPr>
+          <w:p>
+            <w:pPr>
+              <w:tabs>
+                <w:tab w:val="left" w:pos="9355"/>
+              </w:tabs>
+              <w:spacing w:line="276" w:lineRule="auto"/>
+              <w:ind w:left="75" w:right="118"/>
+              <w:jc w:val="both"/>
+            </w:pPr>
+            <w:r>
+              <w:rPr>
+                <w:rStyle w:val="Strong"/>
+                <w:b w:val="0"/>
+                <w:bCs w:val="0"/>
+              </w:rPr>
+              <w:t>Software Engineer</w:t>
+            </w:r>
+          </w:p>
+          <w:p>
+            <w:pPr>
+              <w:pStyle w:val="ListParagraph"/>
+              <w:numPr>
+                <w:ilvl w:val="0"/>
+                <w:numId w:val="9"/>
+              </w:numPr>
+              <w:tabs>
+                <w:tab w:val="left" w:pos="839"/>
+                <w:tab w:val="left" w:pos="840"/>
+              </w:tabs>
+              <w:spacing w:after="200" w:line="276" w:lineRule="auto"/>
+              <w:jc w:val="both"/>
+              <w:rPr>
+                <w:rFonts w:eastAsia="Calibri"/>
+                <w:color w:val="000000"/>
+              </w:rPr>
+            </w:pPr>
+            <w:r>
+              <w:rPr>
+                <w:rFonts w:eastAsia="Calibri"/>
+                <w:b/>
+                <w:bCs/>
+                <w:color w:val="000000"/>
+              </w:rPr>
+              <w:t xml:space="preserve">Solely responsible </w:t>
+            </w:r>
+            <w:r>
+              <w:rPr>
+                <w:rFonts w:eastAsia="Calibri"/>
+                <w:color w:val="000000"/>
+              </w:rPr>
+              <w:t xml:space="preserve">for all software-related work across the company — covering frontend, backend, and database. </w:t>
+            </w:r>
+          </w:p>
+          <w:p>
+            <w:pPr>
+              <w:pStyle w:val="ListParagraph"/>
+              <w:numPr>
+                <w:ilvl w:val="0"/>
+                <w:numId w:val="9"/>
+              </w:numPr>
+              <w:tabs>
+                <w:tab w:val="left" w:pos="839"/>
+                <w:tab w:val="left" w:pos="840"/>
+              </w:tabs>
+              <w:spacing w:after="200" w:line="276" w:lineRule="auto"/>
+              <w:jc w:val="both"/>
+              <w:rPr>
+                <w:rFonts w:eastAsia="Calibri"/>
+                <w:color w:val="000000"/>
+              </w:rPr>
+            </w:pPr>
+            <w:r>
+              <w:rPr>
+                <w:rFonts w:eastAsia="Calibri"/>
+                <w:b/>
+                <w:bCs/>
+                <w:color w:val="000000"/>
+              </w:rPr>
+              <w:t>Built and maintained</w:t>
+            </w:r>
+            <w:r>
+              <w:rPr>
+                <w:rFonts w:eastAsia="Calibri"/>
+                <w:color w:val="000000"/>
+              </w:rPr>
+              <w:t xml:space="preserve"> internal web applications end-to-end for business operations. </w:t>
+            </w:r>
+          </w:p>
+          <w:p>
+            <w:pPr>
+              <w:pStyle w:val="ListParagraph"/>
+              <w:numPr>
+                <w:ilvl w:val="0"/>
+                <w:numId w:val="9"/>
+              </w:numPr>
+              <w:tabs>
+                <w:tab w:val="left" w:pos="839"/>
+                <w:tab w:val="left" w:pos="840"/>
+              </w:tabs>
+              <w:spacing w:after="200" w:line="276" w:lineRule="auto"/>
+              <w:jc w:val="both"/>
+              <w:rPr>
+                <w:rFonts w:eastAsia="Calibri"/>
+                <w:color w:val="000000"/>
+              </w:rPr>
+            </w:pPr>
+            <w:r>
+              <w:rPr>
+                <w:rFonts w:eastAsia="Calibri"/>
+                <w:b/>
+                <w:bCs/>
+                <w:color w:val="000000"/>
+              </w:rPr>
+              <w:t xml:space="preserve">Integrated third-party platforms </w:t>
+            </w:r>
+            <w:r>
+              <w:rPr>
+                <w:rFonts w:eastAsia="Calibri"/>
+                <w:color w:val="000000"/>
+              </w:rPr>
+              <w:t>including VNPT eContracts</w:t>
+            </w:r>
+            <w:r>
+              <w:rPr>
+                <w:rFonts w:eastAsia="Calibri"/>
+                <w:color w:val="000000"/>
+              </w:rPr>
+              <w:t xml:space="preserve">, </w:t>
+            </w:r>
+            <w:r>
+              <w:t>Microsoft 365</w:t>
+            </w:r>
+            <w:r>
+              <w:rPr>
+                <w:rFonts w:eastAsia="Calibri"/>
+                <w:color w:val="000000"/>
+              </w:rPr>
+              <w:t xml:space="preserve"> and SAP into internal systems. </w:t>
+            </w:r>
+          </w:p>
+          <w:p>
+            <w:pPr>
+              <w:pStyle w:val="ListParagraph"/>
+              <w:numPr>
+                <w:ilvl w:val="0"/>
+                <w:numId w:val="9"/>
+              </w:numPr>
+              <w:tabs>
+                <w:tab w:val="left" w:pos="839"/>
+                <w:tab w:val="left" w:pos="840"/>
+              </w:tabs>
+              <w:spacing w:after="200" w:line="276" w:lineRule="auto"/>
+              <w:jc w:val="both"/>
+              <w:rPr>
+                <w:b/>
+                <w:bCs/>
+              </w:rPr>
+            </w:pPr>
+            <w:r>
+              <w:rPr>
+                <w:rStyle w:val="Strong"/>
+              </w:rPr>
+              <w:t>Drove</w:t>
+            </w:r>
+            <w:r>
+              <w:t xml:space="preserve"> </w:t>
+            </w:r>
+            <w:r>
+              <w:rPr>
+                <w:b/>
+                <w:bCs/>
+              </w:rPr>
+              <w:t>the</w:t>
+            </w:r>
+            <w:r>
+              <w:t xml:space="preserve"> </w:t>
+            </w:r>
+            <w:r>
+              <w:rPr>
+                <w:rStyle w:val="Strong"/>
+              </w:rPr>
+              <w:t>direction and roadmap</w:t>
+            </w:r>
+            <w:r>
+              <w:t xml:space="preserve"> </w:t>
+            </w:r>
+            <w:r>
+              <w:rPr>
+                <w:b/>
+                <w:bCs/>
+              </w:rPr>
+              <w:t>for</w:t>
+            </w:r>
+            <w:r>
+              <w:t xml:space="preserve"> </w:t>
+            </w:r>
+            <w:r>
+              <w:rPr>
+                <w:rStyle w:val="Strong"/>
+              </w:rPr>
+              <w:t>internal tooling</w:t>
+            </w:r>
+            <w:r>
+              <w:t>, identifying needs and delivering software solutions across departments.</w:t>
+            </w:r>
+          </w:p>
+        </w:tc>
+        <w:tc>
+          <w:tcPr>
+            <w:tcW w:w="1281" w:type="pct"/>
+          </w:tcPr>
+          <w:p>
+            <w:pPr>
+              <w:tabs>
+                <w:tab w:val="left" w:pos="9355"/>
+              </w:tabs>
+              <w:spacing w:line="276" w:lineRule="auto"/>
+              <w:jc w:val="right"/>
+            </w:pPr>
+            <w:r>
+              <w:t>Sep</w:t>
+            </w:r>
+            <w:r>
+              <w:t xml:space="preserve"> 202</w:t>
+            </w:r>
+            <w:r>
+              <w:t>5</w:t>
+            </w:r>
+            <w:r>
+              <w:t xml:space="preserve"> – </w:t>
+            </w:r>
+            <w:r>
+              <w:t>Present</w:t>
+            </w:r>
+          </w:p>
+        </w:tc>
+      </w:tr>
+      <w:tr>
+        <w:trPr>
+          <w:trHeight w:val="189"/>
+        </w:trPr>
+        <w:tc>
+          <w:tcPr>
+            <w:tcW w:w="3717" w:type="pct"/>
+          </w:tcPr>
+          <w:p>
+            <w:pPr>
+              <w:tabs>
+                <w:tab w:val="left" w:pos="9489"/>
+              </w:tabs>
+              <w:spacing w:line="276" w:lineRule="auto"/>
+              <w:ind w:left="75"/>
+            </w:pPr>
+            <w:r>
+              <w:rPr>
+                <w:rFonts w:eastAsia="Calibri"/>
+                <w:b/>
+              </w:rPr>
+              <w:t>ADDJ Technology Development JSC</w:t>
+            </w:r>
+          </w:p>
+        </w:tc>
+        <w:tc>
+          <w:tcPr>
+            <w:tcW w:w="1281" w:type="pct"/>
+          </w:tcPr>
+          <w:p>
+            <w:pPr>
+              <w:tabs>
+                <w:tab w:val="left" w:pos="9489"/>
+              </w:tabs>
+              <w:spacing w:line="276" w:lineRule="auto"/>
+              <w:jc w:val="right"/>
+            </w:pPr>
+            <w:r>
+              <w:t>Hanoi, Vietnam</w:t>
+            </w:r>
+          </w:p>
+        </w:tc>
+      </w:tr>
+      <w:tr>
+        <w:trPr>
+          <w:trHeight w:val="268"/>
+        </w:trPr>
+        <w:tc>
+          <w:tcPr>
+            <w:tcW w:w="3717" w:type="pct"/>
+          </w:tcPr>
+          <w:p>
+            <w:pPr>
+              <w:tabs>
+                <w:tab w:val="left" w:pos="9355"/>
+              </w:tabs>
+              <w:spacing w:line="276" w:lineRule="auto"/>
+              <w:ind w:left="75" w:right="118"/>
+            </w:pPr>
+            <w:r>
+              <w:t xml:space="preserve">Software Engineer </w:t>
+            </w:r>
+            <w:r>
+              <w:t>/ Head of Digital Solutions</w:t>
+            </w:r>
+          </w:p>
+          <w:p>
+            <w:pPr>
+              <w:pStyle w:val="ListParagraph"/>
+              <w:numPr>
+                <w:ilvl w:val="0"/>
+                <w:numId w:val="9"/>
+              </w:numPr>
+              <w:pBdr>
+                <w:top w:val="nil"/>
+                <w:left w:val="nil"/>
+                <w:bottom w:val="nil"/>
+                <w:right w:val="nil"/>
+                <w:between w:val="nil"/>
+              </w:pBdr>
+              <w:tabs>
+                <w:tab w:val="left" w:pos="839"/>
+                <w:tab w:val="left" w:pos="840"/>
+              </w:tabs>
+              <w:spacing w:after="200" w:line="276" w:lineRule="auto"/>
+              <w:jc w:val="both"/>
+              <w:rPr>
+                <w:rFonts w:eastAsia="Calibri"/>
+                <w:color w:val="000000"/>
+              </w:rPr>
+            </w:pPr>
+            <w:r>
+              <w:rPr>
+                <w:rFonts w:eastAsia="Calibri"/>
+                <w:b/>
+                <w:bCs/>
+                <w:color w:val="000000"/>
+              </w:rPr>
+              <w:t xml:space="preserve">Built an AI-powered document search platform </w:t>
+            </w:r>
+            <w:r>
+              <w:rPr>
+                <w:rFonts w:eastAsia="Calibri"/>
+                <w:color w:val="000000"/>
+              </w:rPr>
+              <w:t xml:space="preserve">using LLMs and vector search, enabling full-text semantic search across thousands of internal documents. </w:t>
+            </w:r>
+          </w:p>
+          <w:p>
+            <w:pPr>
+              <w:pStyle w:val="ListParagraph"/>
+              <w:numPr>
+                <w:ilvl w:val="0"/>
+                <w:numId w:val="9"/>
+              </w:numPr>
+              <w:pBdr>
+                <w:top w:val="nil"/>
+                <w:left w:val="nil"/>
+                <w:bottom w:val="nil"/>
+                <w:right w:val="nil"/>
+                <w:between w:val="nil"/>
+              </w:pBdr>
+              <w:tabs>
+                <w:tab w:val="left" w:pos="839"/>
+                <w:tab w:val="left" w:pos="840"/>
+              </w:tabs>
+              <w:spacing w:after="200" w:line="276" w:lineRule="auto"/>
+              <w:jc w:val="both"/>
+              <w:rPr>
+                <w:rFonts w:eastAsia="Calibri"/>
+                <w:b/>
+                <w:bCs/>
+                <w:color w:val="000000"/>
+              </w:rPr>
+            </w:pPr>
+            <w:r>
+              <w:rPr>
+                <w:rFonts w:eastAsia="Calibri"/>
+                <w:b/>
+                <w:bCs/>
+                <w:color w:val="000000"/>
+              </w:rPr>
+              <w:t xml:space="preserve">Developed an OCR-based information extraction system </w:t>
+            </w:r>
+            <w:r>
+              <w:rPr>
+                <w:rFonts w:eastAsia="Calibri"/>
+                <w:color w:val="000000"/>
+              </w:rPr>
+              <w:t>to digitize and structure data from scanned documents — reducing manual processing time significantly.</w:t>
+            </w:r>
+            <w:r>
+              <w:rPr>
+                <w:rFonts w:eastAsia="Calibri"/>
+                <w:b/>
+                <w:bCs/>
+                <w:color w:val="000000"/>
+              </w:rPr>
+              <w:t xml:space="preserve"> </w:t>
+            </w:r>
+          </w:p>
+          <w:p>
+            <w:pPr>
+              <w:pStyle w:val="ListParagraph"/>
+              <w:numPr>
+                <w:ilvl w:val="0"/>
+                <w:numId w:val="9"/>
+              </w:numPr>
+              <w:pBdr>
+                <w:top w:val="nil"/>
+                <w:left w:val="nil"/>
+                <w:bottom w:val="nil"/>
+                <w:right w:val="nil"/>
+                <w:between w:val="nil"/>
+              </w:pBdr>
+              <w:tabs>
+                <w:tab w:val="left" w:pos="839"/>
+                <w:tab w:val="left" w:pos="840"/>
+              </w:tabs>
+              <w:spacing w:after="200" w:line="276" w:lineRule="auto"/>
+              <w:jc w:val="both"/>
+              <w:rPr>
+                <w:rFonts w:eastAsia="Calibri"/>
+                <w:color w:val="000000"/>
+              </w:rPr>
+            </w:pPr>
+            <w:r>
+              <w:rPr>
+                <w:rFonts w:eastAsia="Calibri"/>
+                <w:b/>
+                <w:bCs/>
+                <w:color w:val="000000"/>
+              </w:rPr>
+              <w:t>Designed and implemented a data warehouse</w:t>
+            </w:r>
+            <w:r>
+              <w:rPr>
+                <w:rFonts w:eastAsia="Calibri"/>
+                <w:color w:val="000000"/>
+              </w:rPr>
+              <w:t xml:space="preserve"> to centralize company data, supporting business reporting and analytics. </w:t>
+            </w:r>
+          </w:p>
+          <w:p>
+            <w:pPr>
+              <w:pStyle w:val="ListParagraph"/>
+              <w:numPr>
+                <w:ilvl w:val="0"/>
+                <w:numId w:val="9"/>
+              </w:numPr>
+              <w:pBdr>
+                <w:top w:val="nil"/>
+                <w:left w:val="nil"/>
+                <w:bottom w:val="nil"/>
+                <w:right w:val="nil"/>
+                <w:between w:val="nil"/>
+              </w:pBdr>
+              <w:tabs>
+                <w:tab w:val="left" w:pos="839"/>
+                <w:tab w:val="left" w:pos="840"/>
+              </w:tabs>
+              <w:spacing w:after="200" w:line="276" w:lineRule="auto"/>
+              <w:jc w:val="both"/>
+              <w:rPr>
+                <w:rFonts w:eastAsia="Calibri"/>
+                <w:b/>
+                <w:bCs/>
+                <w:color w:val="000000"/>
+              </w:rPr>
+            </w:pPr>
+            <w:r>
+              <w:rPr>
+                <w:rFonts w:eastAsia="Calibri"/>
+                <w:b/>
+                <w:bCs/>
+                <w:color w:val="000000"/>
+              </w:rPr>
+              <w:t>Created a smart recommendation engine</w:t>
+            </w:r>
+            <w:r>
+              <w:rPr>
+                <w:rFonts w:eastAsia="Calibri"/>
+                <w:color w:val="000000"/>
+              </w:rPr>
+              <w:t xml:space="preserve"> leveraging user behavior data to personalize content delivery.</w:t>
+            </w:r>
+            <w:r>
+              <w:rPr>
+                <w:rFonts w:eastAsia="Calibri"/>
+                <w:b/>
+                <w:bCs/>
+                <w:color w:val="000000"/>
+              </w:rPr>
+              <w:t xml:space="preserve"> </w:t>
+            </w:r>
+          </w:p>
+          <w:p>
+            <w:pPr>
+              <w:pStyle w:val="ListParagraph"/>
+              <w:numPr>
+                <w:ilvl w:val="0"/>
+                <w:numId w:val="9"/>
+              </w:numPr>
+              <w:pBdr>
+                <w:top w:val="nil"/>
+                <w:left w:val="nil"/>
+                <w:bottom w:val="nil"/>
+                <w:right w:val="nil"/>
+                <w:between w:val="nil"/>
+              </w:pBdr>
+              <w:tabs>
+                <w:tab w:val="left" w:pos="839"/>
+                <w:tab w:val="left" w:pos="840"/>
+              </w:tabs>
+              <w:spacing w:after="200" w:line="276" w:lineRule="auto"/>
+              <w:jc w:val="both"/>
+              <w:rPr>
+                <w:rFonts w:eastAsia="Calibri"/>
+                <w:b/>
+                <w:bCs/>
+                <w:color w:val="000000"/>
+              </w:rPr>
+            </w:pPr>
+            <w:r>
+              <w:rPr>
+                <w:rStyle w:val="Strong"/>
+              </w:rPr>
+              <w:t>Deployed and maintained a NextCloud storage system</w:t>
+            </w:r>
+            <w:r>
+              <w:t xml:space="preserve"> serving 50+ employees, managing access control, uptime, and storage workflows.</w:t>
+            </w:r>
+          </w:p>
+          <w:p>
+            <w:pPr>
+              <w:pStyle w:val="ListParagraph"/>
+              <w:numPr>
+                <w:ilvl w:val="0"/>
+                <w:numId w:val="9"/>
+              </w:numPr>
+              <w:pBdr>
+                <w:top w:val="nil"/>
+                <w:left w:val="nil"/>
+                <w:bottom w:val="nil"/>
+                <w:right w:val="nil"/>
+                <w:between w:val="nil"/>
+              </w:pBdr>
+              <w:tabs>
+                <w:tab w:val="left" w:pos="839"/>
+                <w:tab w:val="left" w:pos="840"/>
+              </w:tabs>
+              <w:spacing w:after="200" w:line="276" w:lineRule="auto"/>
+              <w:jc w:val="both"/>
+            </w:pPr>
+            <w:r>
+              <w:rPr>
+                <w:rFonts w:eastAsia="Calibri"/>
+                <w:b/>
+                <w:bCs/>
+                <w:color w:val="000000"/>
+              </w:rPr>
+              <w:t>Led large-scale document digitization projects</w:t>
+            </w:r>
+            <w:r>
+              <w:rPr>
+                <w:rFonts w:eastAsia="Calibri"/>
+                <w:color w:val="000000"/>
+              </w:rPr>
+              <w:t>, defining workflows, quality standards, and delivery timelines.</w:t>
+            </w:r>
+          </w:p>
+        </w:tc>
+        <w:tc>
+          <w:tcPr>
+            <w:tcW w:w="1281" w:type="pct"/>
+          </w:tcPr>
+          <w:p>
+            <w:pPr>
+              <w:tabs>
+                <w:tab w:val="left" w:pos="9355"/>
+              </w:tabs>
+              <w:spacing w:line="276" w:lineRule="auto"/>
+              <w:jc w:val="right"/>
+            </w:pPr>
+            <w:r>
+              <w:t xml:space="preserve">Jun 2020 – </w:t>
+            </w:r>
+            <w:r>
+              <w:t>Sep 2025</w:t>
+            </w:r>
+          </w:p>
+        </w:tc>
+      </w:tr>
       <w:tr>
         <w:trPr>
           <w:trHeight w:val="189"/>
@@ -369,14 +1007,13 @@
                 <w:tab w:val="left" w:pos="9489"/>
               </w:tabs>
               <w:spacing w:line="276" w:lineRule="auto"/>
-              <w:ind w:left="75"/>
             </w:pPr>
             <w:r>
               <w:rPr>
-                <w:rFonts w:eastAsia="Calibri"/>
                 <w:b/>
-              </w:rPr>
-              <w:t>ADDJ Technology Development JSC</w:t>
+                <w:bCs/>
+              </w:rPr>
+              <w:t>Fubon Life Vietnam Insurance Co., Ltd.</w:t>
             </w:r>
           </w:p>
         </w:tc>
@@ -412,10 +1049,83 @@
                 <w:tab w:val="left" w:pos="9355"/>
               </w:tabs>
               <w:spacing w:line="276" w:lineRule="auto"/>
-              <w:ind w:left="75" w:right="118"/>
+              <w:ind w:right="118"/>
             </w:pPr>
             <w:r>
-              <w:t>Data Engineer/ Head of Digital Solutions</w:t>
+              <w:t>Software Development Intern</w:t>
+            </w:r>
+          </w:p>
+          <w:p>
+            <w:pPr>
+              <w:pStyle w:val="ListParagraph"/>
+              <w:numPr>
+                <w:ilvl w:val="0"/>
+                <w:numId w:val="9"/>
+              </w:numPr>
+              <w:pBdr>
+                <w:top w:val="nil"/>
+                <w:left w:val="nil"/>
+                <w:bottom w:val="nil"/>
+                <w:right w:val="nil"/>
+                <w:between w:val="nil"/>
+              </w:pBdr>
+              <w:tabs>
+                <w:tab w:val="left" w:pos="839"/>
+                <w:tab w:val="left" w:pos="840"/>
+              </w:tabs>
+              <w:spacing w:after="200" w:line="276" w:lineRule="auto"/>
+              <w:jc w:val="both"/>
+              <w:rPr>
+                <w:rFonts w:eastAsia="Calibri"/>
+                <w:color w:val="000000"/>
+              </w:rPr>
+            </w:pPr>
+            <w:r>
+              <w:rPr>
+                <w:rFonts w:eastAsia="Calibri"/>
+                <w:b/>
+                <w:bCs/>
+                <w:color w:val="000000"/>
+              </w:rPr>
+              <w:t>Developed and maintained</w:t>
+            </w:r>
+            <w:r>
+              <w:rPr>
+                <w:rFonts w:eastAsia="Calibri"/>
+                <w:color w:val="000000"/>
+              </w:rPr>
+              <w:t xml:space="preserve"> internal web applications using Java and Python. </w:t>
+            </w:r>
+          </w:p>
+          <w:p>
+            <w:pPr>
+              <w:pStyle w:val="ListParagraph"/>
+              <w:numPr>
+                <w:ilvl w:val="0"/>
+                <w:numId w:val="9"/>
+              </w:numPr>
+              <w:tabs>
+                <w:tab w:val="left" w:pos="839"/>
+                <w:tab w:val="left" w:pos="840"/>
+              </w:tabs>
+              <w:spacing w:after="200" w:line="276" w:lineRule="auto"/>
+              <w:jc w:val="both"/>
+            </w:pPr>
+            <w:r>
+              <w:rPr>
+                <w:rFonts w:eastAsia="Calibri"/>
+                <w:b/>
+                <w:bCs/>
+                <w:color w:val="000000"/>
+              </w:rPr>
+              <w:t xml:space="preserve">Implemented new features and resolved bugs </w:t>
+            </w:r>
+            <w:r>
+              <w:rPr>
+                <w:rFonts w:eastAsia="Calibri"/>
+                <w:color w:val="000000"/>
+              </w:rPr>
+              <w:t>for business operations tools used across departments</w:t>
             </w:r>
           </w:p>
         </w:tc>
@@ -432,7 +1142,10 @@
               <w:jc w:val="right"/>
             </w:pPr>
             <w:r>
-              <w:t>Jun 2020 – Present</w:t>
+              <w:rPr>
+                <w:rFonts w:eastAsia="Calibri"/>
+              </w:rPr>
+              <w:t>Sep 2019 – Mar 2020</w:t>
             </w:r>
           </w:p>
         </w:tc>
@@ -440,11 +1153,6 @@
     </w:tbl>
     <w:p>
       <w:pPr>
-        <w:pStyle w:val="ListParagraph"/>
-        <w:numPr>
-          <w:ilvl w:val="0"/>
-          <w:numId w:val="9"/>
-        </w:numPr>
         <w:pBdr>
           <w:top w:val="nil"/>
           <w:left w:val="nil"/>
@@ -456,19 +1164,40 @@
           <w:tab w:val="left" w:pos="839"/>
           <w:tab w:val="left" w:pos="840"/>
         </w:tabs>
-        <w:spacing w:before="120" w:line="276" w:lineRule="auto"/>
-        <w:ind w:right="475"/>
+        <w:spacing w:after="200" w:line="276" w:lineRule="auto"/>
         <w:rPr>
           <w:rFonts w:eastAsia="Calibri"/>
           <w:color w:val="000000"/>
         </w:rPr>
       </w:pPr>
-      <w:r>
-        <w:rPr>
-          <w:rFonts w:eastAsia="Calibri"/>
-          <w:color w:val="000000"/>
-        </w:rPr>
-        <w:t>Designed and implemented a data warehouse to centralize company data.</w:t>
+    </w:p>
+    <w:p>
+      <w:pPr>
+        <w:pStyle w:val="Heading2"/>
+        <w:pBdr>
+          <w:top w:val="nil"/>
+          <w:left w:val="nil"/>
+          <w:bottom w:val="single" w:sz="8" w:space="2" w:color="000000"/>
+          <w:right w:val="nil"/>
+          <w:between w:val="nil"/>
+        </w:pBdr>
+        <w:spacing w:before="120" w:after="200"/>
+        <w:ind w:right="0"/>
+        <w:jc w:val="left"/>
+        <w:rPr>
+          <w:rFonts w:ascii="Times New Roman" w:hAnsi="Times New Roman" w:cs="Times New Roman"/>
+          <w:sz w:val="24"/>
+          <w:szCs w:val="24"/>
+        </w:rPr>
+      </w:pPr>
+      <w:r>
+        <w:rPr>
+          <w:rFonts w:ascii="Times New Roman" w:hAnsi="Times New Roman" w:cs="Times New Roman"/>
+          <w:sz w:val="24"/>
+          <w:szCs w:val="24"/>
+        </w:rPr>
+        <w:lastRenderedPageBreak/>
+        <w:t xml:space="preserve">Technical Skills </w:t>
       </w:r>
     </w:p>
     <w:p>
@@ -498,9 +1227,18 @@
       <w:r>
         <w:rPr>
           <w:rFonts w:eastAsia="Calibri"/>
+          <w:b/>
+          <w:bCs/>
           <w:color w:val="000000"/>
         </w:rPr>
-        <w:t>Developed a smart recommendation engine leveraging user behavior data.</w:t>
+        <w:t>Languages:</w:t>
+      </w:r>
+      <w:r>
+        <w:rPr>
+          <w:rFonts w:eastAsia="Calibri"/>
+          <w:color w:val="000000"/>
+        </w:rPr>
+        <w:t xml:space="preserve"> Python, SQL </w:t>
       </w:r>
     </w:p>
     <w:p>
@@ -530,9 +1268,35 @@
       <w:r>
         <w:rPr>
           <w:rFonts w:eastAsia="Calibri"/>
+          <w:b/>
+          <w:bCs/>
           <w:color w:val="000000"/>
         </w:rPr>
-        <w:t>Built an internal document search platform using LLM and vector search.</w:t>
+        <w:t>Backend &amp; APIs:</w:t>
+      </w:r>
+      <w:r>
+        <w:rPr>
+          <w:rFonts w:eastAsia="Calibri"/>
+          <w:color w:val="000000"/>
+        </w:rPr>
+        <w:t xml:space="preserve"> RESTful API design, system architecture, ETL/ELT pipelines</w:t>
+      </w:r>
+      <w:r>
+        <w:rPr>
+          <w:rFonts w:eastAsia="Calibri"/>
+          <w:color w:val="000000"/>
+        </w:rPr>
+        <w:t xml:space="preserve">, </w:t>
+      </w:r>
+      <w:r>
+        <w:t>FastAPI, Flask</w:t>
+      </w:r>
+      <w:r>
+        <w:rPr>
+          <w:rFonts w:eastAsia="Calibri"/>
+          <w:color w:val="000000"/>
+        </w:rPr>
+        <w:t xml:space="preserve"> </w:t>
       </w:r>
     </w:p>
     <w:p>
@@ -562,9 +1326,18 @@
       <w:r>
         <w:rPr>
           <w:rFonts w:eastAsia="Calibri"/>
+          <w:b/>
+          <w:bCs/>
           <w:color w:val="000000"/>
         </w:rPr>
-        <w:t>Created an OCR-based information extraction system for scanned documents.</w:t>
+        <w:t>Databases:</w:t>
+      </w:r>
+      <w:r>
+        <w:rPr>
+          <w:rFonts w:eastAsia="Calibri"/>
+          <w:color w:val="000000"/>
+        </w:rPr>
+        <w:t xml:space="preserve"> PostgreSQL, MySQL, SQL Server, MongoDB, Redis, Elasticsearch </w:t>
       </w:r>
     </w:p>
     <w:p>
@@ -594,9 +1367,18 @@
       <w:r>
         <w:rPr>
           <w:rFonts w:eastAsia="Calibri"/>
+          <w:b/>
+          <w:bCs/>
           <w:color w:val="000000"/>
         </w:rPr>
-        <w:t>Deployed and maintained NextCloud storage serving 50+ employees.</w:t>
+        <w:t>AI &amp; Search:</w:t>
+      </w:r>
+      <w:r>
+        <w:rPr>
+          <w:rFonts w:eastAsia="Calibri"/>
+          <w:color w:val="000000"/>
+        </w:rPr>
+        <w:t xml:space="preserve"> LLM integration, RAG, Vector Search (Faiss, RedisVL), OCR, NLP, AI Agents </w:t>
       </w:r>
     </w:p>
     <w:p>
@@ -620,15 +1402,35 @@
         <w:spacing w:after="200" w:line="276" w:lineRule="auto"/>
         <w:rPr>
           <w:rFonts w:eastAsia="Calibri"/>
+          <w:b/>
+          <w:bCs/>
           <w:color w:val="000000"/>
         </w:rPr>
       </w:pPr>
       <w:r>
         <w:rPr>
           <w:rFonts w:eastAsia="Calibri"/>
+          <w:b/>
+          <w:bCs/>
           <w:color w:val="000000"/>
         </w:rPr>
-        <w:t>Built internal systems for task and asset management.</w:t>
+        <w:t xml:space="preserve">DevOps &amp; Cloud: </w:t>
+      </w:r>
+      <w:r>
+        <w:rPr>
+          <w:rFonts w:eastAsia="Calibri"/>
+          <w:color w:val="000000"/>
+        </w:rPr>
+        <w:t>Docker, Linux, Git</w:t>
+      </w:r>
+      <w:r>
+        <w:rPr>
+          <w:rFonts w:eastAsia="Calibri"/>
+          <w:b/>
+          <w:bCs/>
+          <w:color w:val="000000"/>
+        </w:rPr>
+        <w:t xml:space="preserve"> </w:t>
       </w:r>
     </w:p>
     <w:p>
@@ -658,132 +1460,50 @@
       <w:r>
         <w:rPr>
           <w:rFonts w:eastAsia="Calibri"/>
+          <w:b/>
+          <w:bCs/>
           <w:color w:val="000000"/>
         </w:rPr>
-        <w:t>Managed large-scale document digitization projects, establishing workflows to ensure deadlines and data quality.</w:t>
-      </w:r>
-    </w:p>
-    <w:tbl>
-      <w:tblPr>
-        <w:tblW w:w="5000" w:type="pct"/>
-        <w:tblLook w:val="04A0" w:firstRow="1" w:lastRow="0" w:firstColumn="1" w:lastColumn="0" w:noHBand="0" w:noVBand="1"/>
-      </w:tblPr>
-      <w:tblGrid>
-        <w:gridCol w:w="8009"/>
-        <w:gridCol w:w="2791"/>
-      </w:tblGrid>
-      <w:tr>
-        <w:trPr>
-          <w:trHeight w:val="189"/>
-        </w:trPr>
-        <w:tc>
-          <w:tcPr>
-            <w:tcW w:w="3708" w:type="pct"/>
-          </w:tcPr>
-          <w:p>
-            <w:pPr>
-              <w:tabs>
-                <w:tab w:val="left" w:pos="9489"/>
-              </w:tabs>
-              <w:spacing w:line="276" w:lineRule="auto"/>
-            </w:pPr>
-            <w:r>
-              <w:rPr>
-                <w:b/>
-                <w:bCs/>
-              </w:rPr>
-              <w:t>Fubon Life Vietnam Insurance Co., Ltd.</w:t>
-            </w:r>
-          </w:p>
-        </w:tc>
-        <w:tc>
-          <w:tcPr>
-            <w:tcW w:w="1292" w:type="pct"/>
-          </w:tcPr>
-          <w:p>
-            <w:pPr>
-              <w:tabs>
-                <w:tab w:val="left" w:pos="9489"/>
-              </w:tabs>
-              <w:spacing w:line="276" w:lineRule="auto"/>
-              <w:jc w:val="right"/>
-            </w:pPr>
-            <w:r>
-              <w:t>Hanoi, Vietnam</w:t>
-            </w:r>
-          </w:p>
-        </w:tc>
-      </w:tr>
-      <w:tr>
-        <w:trPr>
-          <w:trHeight w:val="268"/>
-        </w:trPr>
-        <w:tc>
-          <w:tcPr>
-            <w:tcW w:w="3708" w:type="pct"/>
-          </w:tcPr>
-          <w:p>
-            <w:pPr>
-              <w:tabs>
-                <w:tab w:val="left" w:pos="9355"/>
-              </w:tabs>
-              <w:spacing w:line="276" w:lineRule="auto"/>
-              <w:ind w:right="118"/>
-            </w:pPr>
-            <w:r>
-              <w:t>Software Development Intern</w:t>
-            </w:r>
-          </w:p>
-        </w:tc>
-        <w:tc>
-          <w:tcPr>
-            <w:tcW w:w="1292" w:type="pct"/>
-          </w:tcPr>
-          <w:p>
-            <w:pPr>
-              <w:tabs>
-                <w:tab w:val="left" w:pos="9355"/>
-              </w:tabs>
-              <w:spacing w:line="276" w:lineRule="auto"/>
-              <w:jc w:val="right"/>
-            </w:pPr>
-            <w:r>
-              <w:rPr>
-                <w:rFonts w:eastAsia="Calibri"/>
-              </w:rPr>
-              <w:t>Sep 2019 – Mar 2020</w:t>
-            </w:r>
-          </w:p>
-        </w:tc>
-      </w:tr>
-    </w:tbl>
-    <w:p>
-      <w:pPr>
-        <w:pStyle w:val="ListParagraph"/>
-        <w:numPr>
-          <w:ilvl w:val="0"/>
-          <w:numId w:val="10"/>
-        </w:numPr>
-        <w:pBdr>
-          <w:top w:val="nil"/>
-          <w:left w:val="nil"/>
-          <w:bottom w:val="nil"/>
-          <w:right w:val="nil"/>
-          <w:between w:val="nil"/>
-        </w:pBdr>
-        <w:tabs>
-          <w:tab w:val="left" w:pos="839"/>
-          <w:tab w:val="left" w:pos="840"/>
-        </w:tabs>
-        <w:spacing w:before="120" w:line="276" w:lineRule="auto"/>
-        <w:ind w:right="965"/>
-      </w:pPr>
+        <w:t>Soft</w:t>
+      </w:r>
       <w:r>
         <w:rPr>
           <w:rFonts w:eastAsia="Calibri"/>
           <w:color w:val="000000"/>
         </w:rPr>
-        <w:t>Supported the development and maintenance of internal business applications.</w:t>
+        <w:t xml:space="preserve"> </w:t>
+      </w:r>
+      <w:r>
+        <w:rPr>
+          <w:rFonts w:eastAsia="Calibri"/>
+          <w:b/>
+          <w:bCs/>
+          <w:color w:val="000000"/>
+        </w:rPr>
+        <w:t>Skills</w:t>
+      </w:r>
+      <w:r>
+        <w:rPr>
+          <w:rFonts w:eastAsia="Calibri"/>
+          <w:color w:val="000000"/>
+        </w:rPr>
+        <w:t>:</w:t>
+      </w:r>
+      <w:r>
+        <w:rPr>
+          <w:rFonts w:eastAsia="Calibri"/>
+          <w:b/>
+          <w:bCs/>
+          <w:color w:val="000000"/>
+        </w:rPr>
+        <w:t xml:space="preserve"> </w:t>
+      </w:r>
+      <w:r>
+        <w:rPr>
+          <w:rFonts w:eastAsia="Calibri"/>
+          <w:color w:val="000000"/>
+        </w:rPr>
+        <w:t>Project management, Team leadership, Problem-solving</w:t>
       </w:r>
     </w:p>
     <w:p>
@@ -811,7 +1531,7 @@
           <w:sz w:val="24"/>
           <w:szCs w:val="24"/>
         </w:rPr>
-        <w:t xml:space="preserve">Technical Skills </w:t>
+        <w:t>Personal Projects</w:t>
       </w:r>
     </w:p>
     <w:p>
@@ -824,27 +1544,31 @@
         <w:spacing w:line="276" w:lineRule="auto"/>
         <w:rPr>
           <w:rFonts w:eastAsia="Calibri"/>
-        </w:rPr>
-      </w:pPr>
-      <w:r>
-        <w:rPr>
-          <w:rFonts w:eastAsia="Calibri"/>
           <w:b/>
           <w:bCs/>
         </w:rPr>
-        <w:t>Programming Languages:</w:t>
-      </w:r>
-      <w:r>
-        <w:rPr>
-          <w:rFonts w:eastAsia="Calibri"/>
-        </w:rPr>
-        <w:t xml:space="preserve"> Python</w:t>
-      </w:r>
-      <w:r>
-        <w:rPr>
-          <w:rFonts w:eastAsia="Calibri"/>
-        </w:rPr>
-        <w:t>, SQL</w:t>
+      </w:pPr>
+      <w:r>
+        <w:rPr>
+          <w:rFonts w:eastAsia="Calibri"/>
+          <w:b/>
+          <w:bCs/>
+        </w:rPr>
+        <w:t xml:space="preserve">English Learning App — </w:t>
+      </w:r>
+      <w:r>
+        <w:rPr>
+          <w:rFonts w:eastAsia="Calibri"/>
+        </w:rPr>
+        <w:t>AI-powered daily vocabulary push notifications with personalized learning suggestions (Python, SQLite, Cron Jobs)</w:t>
+      </w:r>
+      <w:r>
+        <w:rPr>
+          <w:rFonts w:eastAsia="Calibri"/>
+          <w:b/>
+          <w:bCs/>
+        </w:rPr>
+        <w:t xml:space="preserve"> </w:t>
       </w:r>
     </w:p>
     <w:p>
@@ -865,31 +1589,13 @@
           <w:b/>
           <w:bCs/>
         </w:rPr>
-        <w:t>Data Engineering:</w:t>
-      </w:r>
-      <w:r>
-        <w:rPr>
-          <w:rFonts w:eastAsia="Calibri"/>
-        </w:rPr>
-        <w:t xml:space="preserve"> </w:t>
-      </w:r>
-      <w:r>
-        <w:rPr>
-          <w:rFonts w:eastAsia="Calibri"/>
-        </w:rPr>
-        <w:t>ETL/ELT pipelines</w:t>
-      </w:r>
-      <w:r>
-        <w:rPr>
-          <w:rFonts w:eastAsia="Calibri"/>
-        </w:rPr>
-        <w:t xml:space="preserve">, </w:t>
-      </w:r>
-      <w:r>
-        <w:rPr>
-          <w:rFonts w:eastAsia="Calibri"/>
-        </w:rPr>
-        <w:t>Airflow, dbt</w:t>
+        <w:t xml:space="preserve">News Summarization App </w:t>
+      </w:r>
+      <w:r>
+        <w:rPr>
+          <w:rFonts w:eastAsia="Calibri"/>
+        </w:rPr>
+        <w:t xml:space="preserve">— AI-driven daily news aggregator and summarizer across multiple domains (Python, NLP, LLM) </w:t>
       </w:r>
     </w:p>
     <w:p>
@@ -910,25 +1616,13 @@
           <w:b/>
           <w:bCs/>
         </w:rPr>
-        <w:t>Databases:</w:t>
-      </w:r>
-      <w:r>
-        <w:rPr>
-          <w:rFonts w:eastAsia="Calibri"/>
-        </w:rPr>
-        <w:t xml:space="preserve"> </w:t>
-      </w:r>
-      <w:r>
-        <w:rPr>
-          <w:rFonts w:eastAsia="Calibri"/>
-        </w:rPr>
-        <w:t xml:space="preserve">SQL Server, MySQL, </w:t>
-      </w:r>
-      <w:r>
-        <w:rPr>
-          <w:rFonts w:eastAsia="Calibri"/>
-        </w:rPr>
-        <w:t>PostgreSQL, MongoDB, Redis, Elasticsearch</w:t>
+        <w:t xml:space="preserve">Japanese LMS Web App — </w:t>
+      </w:r>
+      <w:r>
+        <w:rPr>
+          <w:rFonts w:eastAsia="Calibri"/>
+        </w:rPr>
+        <w:t xml:space="preserve">Full-stack learning management system for Japanese language study, built with Flask </w:t>
       </w:r>
     </w:p>
     <w:p>
@@ -949,228 +1643,13 @@
           <w:b/>
           <w:bCs/>
         </w:rPr>
-        <w:t>Big Data &amp; Streaming:</w:t>
-      </w:r>
-      <w:r>
-        <w:rPr>
-          <w:rFonts w:eastAsia="Calibri"/>
-        </w:rPr>
-        <w:t xml:space="preserve"> Apache Spark (PySpark – basic), Apache Kafka (basic)</w:t>
-      </w:r>
-    </w:p>
-    <w:p>
-      <w:pPr>
-        <w:pStyle w:val="ListParagraph"/>
-        <w:numPr>
-          <w:ilvl w:val="0"/>
-          <w:numId w:val="14"/>
-        </w:numPr>
-        <w:spacing w:line="276" w:lineRule="auto"/>
-        <w:rPr>
-          <w:rFonts w:eastAsia="Calibri"/>
-        </w:rPr>
-      </w:pPr>
-      <w:r>
-        <w:rPr>
-          <w:rFonts w:eastAsia="Calibri"/>
-          <w:b/>
-          <w:bCs/>
-        </w:rPr>
-        <w:t>AI/ML:</w:t>
-      </w:r>
-      <w:r>
-        <w:rPr>
-          <w:rFonts w:eastAsia="Calibri"/>
-        </w:rPr>
-        <w:t xml:space="preserve"> OCR, LLM, RAG, Vector Search (Faiss, RedisVL), </w:t>
-      </w:r>
-      <w:r>
-        <w:rPr>
-          <w:rFonts w:eastAsia="Calibri"/>
-        </w:rPr>
-        <w:t>NLP, AI Agents</w:t>
-      </w:r>
-    </w:p>
-    <w:p>
-      <w:pPr>
-        <w:pStyle w:val="ListParagraph"/>
-        <w:numPr>
-          <w:ilvl w:val="0"/>
-          <w:numId w:val="14"/>
-        </w:numPr>
-        <w:spacing w:line="276" w:lineRule="auto"/>
-        <w:rPr>
-          <w:rFonts w:eastAsia="Calibri"/>
-        </w:rPr>
-      </w:pPr>
-      <w:r>
-        <w:rPr>
-          <w:rFonts w:eastAsia="Calibri"/>
-          <w:b/>
-          <w:bCs/>
-        </w:rPr>
-        <w:t xml:space="preserve">Cloud &amp; </w:t>
-      </w:r>
-      <w:r>
-        <w:rPr>
-          <w:rFonts w:eastAsia="Calibri"/>
-          <w:b/>
-          <w:bCs/>
-        </w:rPr>
-        <w:t>DevOps:</w:t>
-      </w:r>
-      <w:r>
-        <w:rPr>
-          <w:rFonts w:eastAsia="Calibri"/>
-        </w:rPr>
-        <w:t xml:space="preserve"> Docker, Linux, Git, </w:t>
-      </w:r>
-      <w:r>
-        <w:rPr>
-          <w:rFonts w:eastAsia="Calibri"/>
-        </w:rPr>
-        <w:t xml:space="preserve">AWS </w:t>
-      </w:r>
-      <w:r>
-        <w:rPr>
-          <w:rFonts w:eastAsia="Calibri"/>
-        </w:rPr>
-        <w:t>(</w:t>
-      </w:r>
-      <w:r>
-        <w:rPr>
-          <w:rFonts w:eastAsia="Calibri"/>
-        </w:rPr>
-        <w:t>S3 basic)</w:t>
-      </w:r>
-    </w:p>
-    <w:p>
-      <w:pPr>
-        <w:pStyle w:val="ListParagraph"/>
-        <w:numPr>
-          <w:ilvl w:val="0"/>
-          <w:numId w:val="14"/>
-        </w:numPr>
-        <w:spacing w:line="276" w:lineRule="auto"/>
-        <w:rPr>
-          <w:rFonts w:eastAsia="Calibri"/>
-        </w:rPr>
-      </w:pPr>
-      <w:r>
-        <w:rPr>
-          <w:rFonts w:eastAsia="Calibri"/>
-          <w:b/>
-          <w:bCs/>
-        </w:rPr>
-        <w:t>Soft Skills:</w:t>
-      </w:r>
-      <w:r>
-        <w:rPr>
-          <w:rFonts w:eastAsia="Calibri"/>
-        </w:rPr>
-        <w:t xml:space="preserve"> Project management, Team leadership, Problem-solving, Adaptability</w:t>
-      </w:r>
-    </w:p>
-    <w:p>
-      <w:pPr>
-        <w:pStyle w:val="Heading2"/>
-        <w:pBdr>
-          <w:top w:val="nil"/>
-          <w:left w:val="nil"/>
-          <w:bottom w:val="single" w:sz="8" w:space="2" w:color="000000"/>
-          <w:right w:val="nil"/>
-          <w:between w:val="nil"/>
-        </w:pBdr>
-        <w:spacing w:before="120" w:after="200"/>
-        <w:ind w:right="0"/>
-        <w:jc w:val="left"/>
-        <w:rPr>
-          <w:rFonts w:ascii="Times New Roman" w:hAnsi="Times New Roman" w:cs="Times New Roman"/>
-          <w:sz w:val="24"/>
-          <w:szCs w:val="24"/>
-        </w:rPr>
-      </w:pPr>
-      <w:r>
-        <w:rPr>
-          <w:rFonts w:ascii="Times New Roman" w:hAnsi="Times New Roman" w:cs="Times New Roman"/>
-          <w:sz w:val="24"/>
-          <w:szCs w:val="24"/>
-        </w:rPr>
-        <w:t>Personal Projects</w:t>
-      </w:r>
-    </w:p>
-    <w:p>
-      <w:pPr>
-        <w:pStyle w:val="ListParagraph"/>
-        <w:numPr>
-          <w:ilvl w:val="0"/>
-          <w:numId w:val="14"/>
-        </w:numPr>
-        <w:spacing w:line="276" w:lineRule="auto"/>
-        <w:rPr>
-          <w:rFonts w:eastAsia="Calibri"/>
-        </w:rPr>
-      </w:pPr>
-      <w:r>
-        <w:rPr>
-          <w:rFonts w:eastAsia="Calibri"/>
-          <w:b/>
-          <w:bCs/>
-        </w:rPr>
-        <w:t>English Learning App</w:t>
-      </w:r>
-      <w:r>
-        <w:rPr>
-          <w:rFonts w:eastAsia="Calibri"/>
-          <w:b/>
-          <w:bCs/>
-        </w:rPr>
-        <w:t>:</w:t>
-      </w:r>
-      <w:r>
-        <w:rPr>
-          <w:rFonts w:eastAsia="Calibri"/>
-        </w:rPr>
-        <w:t xml:space="preserve"> Automated daily vocabulary push notifications (Python, SQLite, Cron Jobs)</w:t>
-      </w:r>
-    </w:p>
-    <w:p>
-      <w:pPr>
-        <w:pStyle w:val="ListParagraph"/>
-        <w:numPr>
-          <w:ilvl w:val="0"/>
-          <w:numId w:val="14"/>
-        </w:numPr>
-        <w:spacing w:line="276" w:lineRule="auto"/>
-        <w:rPr>
-          <w:rFonts w:eastAsia="Calibri"/>
-        </w:rPr>
-      </w:pPr>
-      <w:r>
-        <w:rPr>
-          <w:rFonts w:eastAsia="Calibri"/>
-          <w:b/>
-          <w:bCs/>
-        </w:rPr>
-        <w:t>News Summarization App:</w:t>
-      </w:r>
-      <w:r>
-        <w:rPr>
-          <w:rFonts w:eastAsia="Calibri"/>
-        </w:rPr>
-        <w:t xml:space="preserve"> Automatically summarized daily news across multiple domains</w:t>
-      </w:r>
-      <w:r>
-        <w:rPr>
-          <w:rFonts w:eastAsia="Calibri"/>
-        </w:rPr>
-        <w:t xml:space="preserve"> </w:t>
-      </w:r>
-      <w:r>
-        <w:rPr>
-          <w:rFonts w:eastAsia="Calibri"/>
-        </w:rPr>
-        <w:t>(Python, NLP).</w:t>
+        <w:t xml:space="preserve">Document Digitization Platform — </w:t>
+      </w:r>
+      <w:r>
+        <w:rPr>
+          <w:rFonts w:eastAsia="Calibri"/>
+        </w:rPr>
+        <w:t>Web app for document scanning, OCR extraction, and PDF compression</w:t>
       </w:r>
     </w:p>
     <w:p>
@@ -1274,7 +1753,7 @@
 </file>
 
 <file path=word/numbering.xml><?xml version="1.0" encoding="utf-8"?>
-<w:numbering xmlns:wpc="http://schemas.microsoft.com/office/word/2010/wordprocessingCanvas" xmlns:cx="http://schemas.microsoft.com/office/drawing/2014/chartex" xmlns:cx1="http://schemas.microsoft.com/office/drawing/2015/9/8/chartex" xmlns:cx2="http://schemas.microsoft.com/office/drawing/2015/10/21/chartex" xmlns:cx3="http://schemas.microsoft.com/office/drawing/2016/5/9/chartex" xmlns:cx4="http://schemas.microsoft.com/office/drawing/2016/5/10/chartex" xmlns:cx5="http://schemas.microsoft.com/office/drawing/2016/5/11/chartex" xmlns:cx6="http://schemas.microsoft.com/office/drawing/2016/5/12/chartex" xmlns:cx7="http://schemas.microsoft.com/office/drawing/2016/5/13/chartex" xmlns:cx8="http://schemas.microsoft.com/office/drawing/2016/5/14/chartex" xmlns:mc="http://schemas.openxmlformats.org/markup-compatibility/2006" xmlns:aink="http://schemas.microsoft.com/office/drawing/2016/ink" xmlns:am3d="http://schemas.microsoft.com/office/drawing/2017/model3d" xmlns:o="urn:schemas-microsoft-com:office:office" xmlns:oel="http://schemas.microsoft.com/office/2019/extlst" xmlns:r="http://schemas.openxmlformats.org/officeDocument/2006/relationships" xmlns:m="http://schemas.openxmlformats.org/officeDocument/2006/math" xmlns:v="urn:schemas-microsoft-com:vml" xmlns:wp14="http://schemas.microsoft.com/office/word/2010/wordprocessingDrawing" xmlns:wp="http://schemas.openxmlformats.org/drawingml/2006/wordprocessingDrawing" xmlns:w10="urn:schemas-microsoft-com:office:word" xmlns:w="http://schemas.openxmlformats.org/wordprocessingml/2006/main" xmlns:w14="http://schemas.microsoft.com/office/word/2010/wordml" xmlns:w15="http://schemas.microsoft.com/office/word/2012/wordml" xmlns:w16cex="http://schemas.microsoft.com/office/word/2018/wordml/cex" xmlns:w16cid="http://schemas.microsoft.com/office/word/2016/wordml/cid" xmlns:w16="http://schemas.microsoft.com/office/word/2018/wordml" xmlns:w16du="http://schemas.microsoft.com/office/word/2023/wordml/word16du" xmlns:w16sdtdh="http://schemas.microsoft.com/office/word/2020/wordml/sdtdatahash" xmlns:w16sdtfl="http://schemas.microsoft.com/office/word/2024/wordml/sdtformatlock" xmlns:w16se="http://schemas.microsoft.com/office/word/2015/wordml/symex" xmlns:wpg="http://schemas.microsoft.com/office/word/2010/wordprocessingGroup" xmlns:wpi="http://schemas.microsoft.com/office/word/2010/wordprocessingInk" xmlns:wne="http://schemas.microsoft.com/office/word/2006/wordml" xmlns:wps="http://schemas.microsoft.com/office/word/2010/wordprocessingShape" mc:Ignorable="w14 w15 w16se w16cid w16 w16cex w16sdtdh w16sdtfl w16du wp14">
+<w:numbering xmlns:wpc="http://schemas.microsoft.com/office/word/2010/wordprocessingCanvas" xmlns:cx="http://schemas.microsoft.com/office/drawing/2014/chartex" xmlns:cx1="http://schemas.microsoft.com/office/drawing/2015/9/8/chartex" xmlns:cx2="http://schemas.microsoft.com/office/drawing/2015/10/21/chartex" xmlns:cx3="http://schemas.microsoft.com/office/drawing/2016/5/9/chartex" xmlns:cx4="http://schemas.microsoft.com/office/drawing/2016/5/10/chartex" xmlns:cx5="http://schemas.microsoft.com/office/drawing/2016/5/11/chartex" xmlns:cx6="http://schemas.microsoft.com/office/drawing/2016/5/12/chartex" xmlns:cx7="http://schemas.microsoft.com/office/drawing/2016/5/13/chartex" xmlns:cx8="http://schemas.microsoft.com/office/drawing/2016/5/14/chartex" xmlns:mc="http://schemas.openxmlformats.org/markup-compatibility/2006" xmlns:aink="http://schemas.microsoft.com/office/drawing/2016/ink" xmlns:am3d="http://schemas.microsoft.com/office/drawing/2017/model3d" xmlns:o="urn:schemas-microsoft-com:office:office" xmlns:r="http://schemas.openxmlformats.org/officeDocument/2006/relationships" xmlns:m="http://schemas.openxmlformats.org/officeDocument/2006/math" xmlns:v="urn:schemas-microsoft-com:vml" xmlns:wp14="http://schemas.microsoft.com/office/word/2010/wordprocessingDrawing" xmlns:wp="http://schemas.openxmlformats.org/drawingml/2006/wordprocessingDrawing" xmlns:w10="urn:schemas-microsoft-com:office:word" xmlns:w="http://schemas.openxmlformats.org/wordprocessingml/2006/main" xmlns:w14="http://schemas.microsoft.com/office/word/2010/wordml" xmlns:w15="http://schemas.microsoft.com/office/word/2012/wordml" xmlns:w16cex="http://schemas.microsoft.com/office/word/2018/wordml/cex" xmlns:w16cid="http://schemas.microsoft.com/office/word/2016/wordml/cid" xmlns:w16="http://schemas.microsoft.com/office/word/2018/wordml" xmlns:w16sdtdh="http://schemas.microsoft.com/office/word/2020/wordml/sdtdatahash" xmlns:w16se="http://schemas.microsoft.com/office/word/2015/wordml/symex" xmlns:wpg="http://schemas.microsoft.com/office/word/2010/wordprocessingGroup" xmlns:wpi="http://schemas.microsoft.com/office/word/2010/wordprocessingInk" xmlns:wne="http://schemas.microsoft.com/office/word/2006/wordml" xmlns:wps="http://schemas.microsoft.com/office/word/2010/wordprocessingShape" mc:Ignorable="w14 w15 w16se w16cid w16 w16cex w16sdtdh wp14">
   <w:abstractNum w:abstractNumId="0" w15:restartNumberingAfterBreak="0">
     <w:nsid w:val="0067193A"/>
     <w:multiLevelType w:val="hybridMultilevel"/>
@@ -2826,53 +3305,53 @@
       </w:rPr>
     </w:lvl>
   </w:abstractNum>
-  <w:num w:numId="1" w16cid:durableId="371804678">
+  <w:num w:numId="1">
     <w:abstractNumId w:val="12"/>
   </w:num>
-  <w:num w:numId="2" w16cid:durableId="1005858292">
+  <w:num w:numId="2">
     <w:abstractNumId w:val="5"/>
   </w:num>
-  <w:num w:numId="3" w16cid:durableId="1928348566">
+  <w:num w:numId="3">
     <w:abstractNumId w:val="11"/>
   </w:num>
-  <w:num w:numId="4" w16cid:durableId="477916702">
+  <w:num w:numId="4">
     <w:abstractNumId w:val="7"/>
   </w:num>
-  <w:num w:numId="5" w16cid:durableId="1760906468">
+  <w:num w:numId="5">
     <w:abstractNumId w:val="1"/>
   </w:num>
-  <w:num w:numId="6" w16cid:durableId="2114470980">
+  <w:num w:numId="6">
     <w:abstractNumId w:val="10"/>
   </w:num>
-  <w:num w:numId="7" w16cid:durableId="690184321">
+  <w:num w:numId="7">
     <w:abstractNumId w:val="0"/>
   </w:num>
-  <w:num w:numId="8" w16cid:durableId="2027170365">
+  <w:num w:numId="8">
     <w:abstractNumId w:val="6"/>
   </w:num>
-  <w:num w:numId="9" w16cid:durableId="470513011">
+  <w:num w:numId="9">
     <w:abstractNumId w:val="4"/>
   </w:num>
-  <w:num w:numId="10" w16cid:durableId="131287365">
+  <w:num w:numId="10">
     <w:abstractNumId w:val="9"/>
   </w:num>
-  <w:num w:numId="11" w16cid:durableId="360011044">
+  <w:num w:numId="11">
     <w:abstractNumId w:val="2"/>
   </w:num>
-  <w:num w:numId="12" w16cid:durableId="513422004">
+  <w:num w:numId="12">
     <w:abstractNumId w:val="13"/>
   </w:num>
-  <w:num w:numId="13" w16cid:durableId="1400595780">
+  <w:num w:numId="13">
     <w:abstractNumId w:val="8"/>
   </w:num>
-  <w:num w:numId="14" w16cid:durableId="2022779103">
+  <w:num w:numId="14">
     <w:abstractNumId w:val="3"/>
   </w:num>
 </w:numbering>
 </file>
 
 <file path=word/styles.xml><?xml version="1.0" encoding="utf-8"?>
-<w:styles xmlns:mc="http://schemas.openxmlformats.org/markup-compatibility/2006" xmlns:r="http://schemas.openxmlformats.org/officeDocument/2006/relationships" xmlns:w="http://schemas.openxmlformats.org/wordprocessingml/2006/main" xmlns:w14="http://schemas.microsoft.com/office/word/2010/wordml" xmlns:w15="http://schemas.microsoft.com/office/word/2012/wordml" xmlns:w16cex="http://schemas.microsoft.com/office/word/2018/wordml/cex" xmlns:w16cid="http://schemas.microsoft.com/office/word/2016/wordml/cid" xmlns:w16="http://schemas.microsoft.com/office/word/2018/wordml" xmlns:w16du="http://schemas.microsoft.com/office/word/2023/wordml/word16du" xmlns:w16sdtdh="http://schemas.microsoft.com/office/word/2020/wordml/sdtdatahash" xmlns:w16sdtfl="http://schemas.microsoft.com/office/word/2024/wordml/sdtformatlock" xmlns:w16se="http://schemas.microsoft.com/office/word/2015/wordml/symex" mc:Ignorable="w14 w15 w16se w16cid w16 w16cex w16sdtdh w16sdtfl w16du">
+<w:styles xmlns:mc="http://schemas.openxmlformats.org/markup-compatibility/2006" xmlns:r="http://schemas.openxmlformats.org/officeDocument/2006/relationships" xmlns:w="http://schemas.openxmlformats.org/wordprocessingml/2006/main" xmlns:w14="http://schemas.microsoft.com/office/word/2010/wordml" xmlns:w15="http://schemas.microsoft.com/office/word/2012/wordml" xmlns:w16cex="http://schemas.microsoft.com/office/word/2018/wordml/cex" xmlns:w16cid="http://schemas.microsoft.com/office/word/2016/wordml/cid" xmlns:w16="http://schemas.microsoft.com/office/word/2018/wordml" xmlns:w16sdtdh="http://schemas.microsoft.com/office/word/2020/wordml/sdtdatahash" xmlns:w16se="http://schemas.microsoft.com/office/word/2015/wordml/symex" mc:Ignorable="w14 w15 w16se w16cid w16 w16cex w16sdtdh">
   <w:docDefaults>
     <w:rPrDefault>
       <w:rPr>
@@ -3575,6 +4054,17 @@
       <w:shd w:val="clear" w:color="auto" w:fill="E1DFDD"/>
     </w:rPr>
   </w:style>
+  <w:style w:type="character" w:styleId="Strong">
+    <w:name w:val="Strong"/>
+    <w:basedOn w:val="DefaultParagraphFont"/>
+    <w:uiPriority w:val="22"/>
+    <w:qFormat/>
+    <w:rsid w:val="0064109D"/>
+    <w:rPr>
+      <w:b/>
+      <w:bCs/>
+    </w:rPr>
+  </w:style>
 </w:styles>
 </file>
 

</xml_diff>